<commit_message>
moved some of the docs for ecological application to an archive
</commit_message>
<xml_diff>
--- a/Docs/BIORXIV_Machine learning applied to otolith timeseries data to discriminate river of origin for Western Alaska Salmon.docx
+++ b/Docs/BIORXIV_Machine learning applied to otolith timeseries data to discriminate river of origin for Western Alaska Salmon.docx
@@ -10202,50 +10202,6 @@
     </w:p>
     <w:p>
       <w:pPr>
-        <w:spacing w:before="100" w:beforeAutospacing="1" w:after="100" w:afterAutospacing="1" w:line="480" w:lineRule="auto"/>
-        <w:outlineLvl w:val="1"/>
-        <w:rPr>
-          <w:rFonts w:ascii="Times New Roman" w:hAnsi="Times New Roman" w:cs="Times New Roman"/>
-          <w:b/>
-          <w:bCs/>
-          <w:sz w:val="40"/>
-          <w:szCs w:val="40"/>
-        </w:rPr>
-      </w:pPr>
-      <w:r>
-        <w:rPr>
-          <w:rFonts w:ascii="Times New Roman" w:hAnsi="Times New Roman" w:cs="Times New Roman"/>
-          <w:b/>
-          <w:bCs/>
-          <w:sz w:val="40"/>
-          <w:szCs w:val="40"/>
-        </w:rPr>
-        <w:lastRenderedPageBreak/>
-        <w:t>Figu</w:t>
-      </w:r>
-      <w:r>
-        <w:rPr>
-          <w:rFonts w:ascii="Times New Roman" w:hAnsi="Times New Roman" w:cs="Times New Roman"/>
-          <w:b/>
-          <w:bCs/>
-          <w:sz w:val="40"/>
-          <w:szCs w:val="40"/>
-        </w:rPr>
-        <w:t>r</w:t>
-      </w:r>
-      <w:r>
-        <w:rPr>
-          <w:rFonts w:ascii="Times New Roman" w:hAnsi="Times New Roman" w:cs="Times New Roman"/>
-          <w:b/>
-          <w:bCs/>
-          <w:sz w:val="40"/>
-          <w:szCs w:val="40"/>
-        </w:rPr>
-        <w:t xml:space="preserve">es </w:t>
-      </w:r>
-    </w:p>
-    <w:p>
-      <w:pPr>
         <w:rPr>
           <w:rStyle w:val="CommentReference"/>
         </w:rPr>
@@ -10256,6 +10212,7 @@
           <w:sz w:val="16"/>
           <w:szCs w:val="16"/>
         </w:rPr>
+        <w:lastRenderedPageBreak/>
         <w:drawing>
           <wp:inline distT="0" distB="0" distL="0" distR="0" wp14:anchorId="7F87A340" wp14:editId="118ED75F">
             <wp:extent cx="4140485" cy="6398842"/>
@@ -10349,7 +10306,6 @@
           <w:b/>
           <w:bCs/>
         </w:rPr>
-        <w:lastRenderedPageBreak/>
         <w:t>B)</w:t>
       </w:r>
       <w:r>
@@ -10382,24 +10338,20 @@
     <w:p>
       <w:pPr>
         <w:rPr>
-          <w:rFonts w:ascii="Garamond" w:hAnsi="Garamond"/>
+          <w:rFonts w:ascii="Times New Roman" w:hAnsi="Times New Roman" w:cs="Times New Roman"/>
+        </w:rPr>
+      </w:pPr>
+    </w:p>
+    <w:p>
+      <w:pPr>
+        <w:rPr>
+          <w:rFonts w:ascii="Times New Roman" w:hAnsi="Times New Roman" w:cs="Times New Roman"/>
           <w:b/>
           <w:bCs/>
           <w:sz w:val="16"/>
           <w:szCs w:val="16"/>
         </w:rPr>
       </w:pPr>
-    </w:p>
-    <w:p>
-      <w:pPr>
-        <w:rPr>
-          <w:rFonts w:ascii="Times New Roman" w:hAnsi="Times New Roman" w:cs="Times New Roman"/>
-          <w:b/>
-          <w:bCs/>
-          <w:sz w:val="16"/>
-          <w:szCs w:val="16"/>
-        </w:rPr>
-      </w:pPr>
       <w:r>
         <w:rPr>
           <w:rFonts w:ascii="Garamond" w:hAnsi="Garamond"/>
@@ -10407,6 +10359,7 @@
           <w:sz w:val="16"/>
           <w:szCs w:val="16"/>
         </w:rPr>
+        <w:lastRenderedPageBreak/>
         <w:drawing>
           <wp:anchor distT="0" distB="0" distL="114300" distR="114300" simplePos="0" relativeHeight="251659264" behindDoc="0" locked="0" layoutInCell="1" allowOverlap="1" wp14:anchorId="2FE91A6D" wp14:editId="1CA782F1">
             <wp:simplePos x="0" y="0"/>
@@ -10468,6 +10421,15 @@
       <w:pPr>
         <w:rPr>
           <w:rFonts w:ascii="Times New Roman" w:hAnsi="Times New Roman" w:cs="Times New Roman"/>
+          <w:b/>
+          <w:bCs/>
+        </w:rPr>
+      </w:pPr>
+    </w:p>
+    <w:p>
+      <w:pPr>
+        <w:rPr>
+          <w:rFonts w:ascii="Times New Roman" w:hAnsi="Times New Roman" w:cs="Times New Roman"/>
         </w:rPr>
       </w:pPr>
       <w:r>
@@ -10908,56 +10870,22 @@
     <w:p>
       <w:pPr>
         <w:rPr>
-          <w:rFonts w:ascii="Garamond" w:hAnsi="Garamond"/>
-          <w:sz w:val="22"/>
-          <w:szCs w:val="22"/>
-        </w:rPr>
-      </w:pPr>
-      <w:r>
-        <w:rPr>
-          <w:rFonts w:ascii="Garamond" w:hAnsi="Garamond"/>
+          <w:rFonts w:ascii="Times New Roman" w:hAnsi="Times New Roman" w:cs="Times New Roman"/>
+        </w:rPr>
+      </w:pPr>
+      <w:r>
+        <w:rPr>
+          <w:rFonts w:ascii="Times New Roman" w:hAnsi="Times New Roman" w:cs="Times New Roman"/>
           <w:b/>
           <w:bCs/>
-          <w:sz w:val="22"/>
-          <w:szCs w:val="22"/>
-        </w:rPr>
-        <w:t xml:space="preserve">Figure </w:t>
-      </w:r>
-      <w:r>
-        <w:rPr>
-          <w:rFonts w:ascii="Garamond" w:hAnsi="Garamond"/>
-          <w:b/>
-          <w:bCs/>
-          <w:sz w:val="22"/>
-          <w:szCs w:val="22"/>
-        </w:rPr>
-        <w:t>5</w:t>
-      </w:r>
-      <w:r>
-        <w:rPr>
-          <w:rFonts w:ascii="Garamond" w:hAnsi="Garamond"/>
-          <w:b/>
-          <w:bCs/>
-          <w:sz w:val="22"/>
-          <w:szCs w:val="22"/>
-        </w:rPr>
-        <w:t>:</w:t>
-      </w:r>
-      <w:r>
-        <w:rPr>
-          <w:rFonts w:ascii="Garamond" w:hAnsi="Garamond"/>
-          <w:sz w:val="22"/>
-          <w:szCs w:val="22"/>
-        </w:rPr>
-        <w:t xml:space="preserve"> Confusion matrix from the highest performing model (Random Forest on GAM Smoothed data) for both total test set and overlapping subset. Boxes along the horizontal axis indicate correctly classified individuals (red). Vertical axis labels are the actual watershed labels whereas horizontal labels are the predicted class from the model. Percentages indicate the percent of the actual class identified as the predicted class</w:t>
-      </w:r>
-      <w:r>
-        <w:rPr>
-          <w:rFonts w:ascii="Garamond" w:hAnsi="Garamond"/>
-          <w:sz w:val="22"/>
-          <w:szCs w:val="22"/>
-        </w:rPr>
-        <w:t xml:space="preserve"> and numbers indicate the number of the actual class assigned to the predicted class. </w:t>
+        </w:rPr>
+        <w:t>Figure 5:</w:t>
+      </w:r>
+      <w:r>
+        <w:rPr>
+          <w:rFonts w:ascii="Times New Roman" w:hAnsi="Times New Roman" w:cs="Times New Roman"/>
+        </w:rPr>
+        <w:t xml:space="preserve"> Confusion matrix from the highest performing model (Random Forest on GAM Smoothed data) for both total test set and overlapping subset. Boxes along the horizontal axis indicate correctly classified individuals (red). Vertical axis labels are the actual watershed labels whereas horizontal labels are the predicted class from the model. Percentages indicate the percent of the actual class identified as the predicted class and numbers indicate the number of the actual class assigned to the predicted class. </w:t>
       </w:r>
     </w:p>
     <w:p>
@@ -11081,76 +11009,22 @@
     <w:p>
       <w:pPr>
         <w:rPr>
-          <w:rFonts w:ascii="Garamond" w:hAnsi="Garamond"/>
-          <w:sz w:val="22"/>
-          <w:szCs w:val="22"/>
-        </w:rPr>
-      </w:pPr>
-      <w:r>
-        <w:rPr>
-          <w:rFonts w:ascii="Garamond" w:hAnsi="Garamond"/>
+          <w:rFonts w:ascii="Times New Roman" w:hAnsi="Times New Roman" w:cs="Times New Roman"/>
+        </w:rPr>
+      </w:pPr>
+      <w:r>
+        <w:rPr>
+          <w:rFonts w:ascii="Times New Roman" w:hAnsi="Times New Roman" w:cs="Times New Roman"/>
           <w:b/>
           <w:bCs/>
-          <w:sz w:val="22"/>
-          <w:szCs w:val="22"/>
         </w:rPr>
         <w:t xml:space="preserve">Figure 6: </w:t>
       </w:r>
       <w:r>
         <w:rPr>
-          <w:rFonts w:ascii="Garamond" w:hAnsi="Garamond"/>
-          <w:sz w:val="22"/>
-          <w:szCs w:val="22"/>
-        </w:rPr>
-        <w:t xml:space="preserve">Classification accuracy </w:t>
-      </w:r>
-      <w:r>
-        <w:rPr>
-          <w:rFonts w:ascii="Garamond" w:hAnsi="Garamond"/>
-          <w:sz w:val="22"/>
-          <w:szCs w:val="22"/>
-        </w:rPr>
-        <w:t>with different</w:t>
-      </w:r>
-      <w:r>
-        <w:rPr>
-          <w:rFonts w:ascii="Garamond" w:hAnsi="Garamond"/>
-          <w:sz w:val="22"/>
-          <w:szCs w:val="22"/>
-        </w:rPr>
-        <w:t xml:space="preserve"> probability threshold</w:t>
-      </w:r>
-      <w:r>
-        <w:rPr>
-          <w:rFonts w:ascii="Garamond" w:hAnsi="Garamond"/>
-          <w:sz w:val="22"/>
-          <w:szCs w:val="22"/>
-        </w:rPr>
-        <w:t>s</w:t>
-      </w:r>
-      <w:r>
-        <w:rPr>
-          <w:rFonts w:ascii="Garamond" w:hAnsi="Garamond"/>
-          <w:sz w:val="22"/>
-          <w:szCs w:val="22"/>
-        </w:rPr>
-        <w:t xml:space="preserve"> (60-90%). Points</w:t>
-      </w:r>
-      <w:r>
-        <w:rPr>
-          <w:rFonts w:ascii="Garamond" w:hAnsi="Garamond"/>
-          <w:sz w:val="22"/>
-          <w:szCs w:val="22"/>
-        </w:rPr>
-        <w:t xml:space="preserve"> </w:t>
-      </w:r>
-      <w:r>
-        <w:rPr>
-          <w:rFonts w:ascii="Garamond" w:hAnsi="Garamond"/>
-          <w:sz w:val="22"/>
-          <w:szCs w:val="22"/>
-        </w:rPr>
-        <w:t xml:space="preserve">indicate the percentage of correctly classified individuals with a calibrated probability value above the given threshold value. Grey dashed lines represent the overall accuracy, whereas colored lines illustrate the class-specific probability at that threshold </w:t>
+          <w:rFonts w:ascii="Times New Roman" w:hAnsi="Times New Roman" w:cs="Times New Roman"/>
+        </w:rPr>
+        <w:t xml:space="preserve">Classification accuracy with different probability thresholds (60-90%). Points indicate the percentage of correctly classified individuals with a calibrated probability value above the given threshold value. Grey dashed lines represent the overall accuracy, whereas colored lines illustrate the class-specific probability at that threshold </w:t>
       </w:r>
     </w:p>
     <w:p>

</xml_diff>